<commit_message>
Added External & Internal Requirements
</commit_message>
<xml_diff>
--- a/SRS.docx
+++ b/SRS.docx
@@ -1116,14 +1116,51 @@
             <w:pPr>
               <w:widowControl w:val="0"/>
               <w:spacing w:after="40" w:before="40" w:line="240" w:lineRule="auto"/>
-              <w:ind w:left="0" w:right="0" w:firstLine="0"/>
               <w:rPr>
                 <w:rFonts w:ascii="Times New Roman" w:cs="Times New Roman" w:eastAsia="Times New Roman" w:hAnsi="Times New Roman"/>
                 <w:sz w:val="20"/>
                 <w:szCs w:val="20"/>
-                <w:u w:val="single"/>
               </w:rPr>
             </w:pPr>
+            <w:r>
+              <w:rPr>
+                <w:rFonts w:ascii="Times New Roman" w:cs="Times New Roman" w:eastAsia="Times New Roman" w:hAnsi="Times New Roman"/>
+                <w:sz w:val="20"/>
+                <w:szCs w:val="20"/>
+                <w:rtl w:val="0"/>
+              </w:rPr>
+              <w:t xml:space="preserve">03/02/2026</w:t>
+            </w:r>
+          </w:p>
+        </w:tc>
+        <w:tc>
+          <w:tcPr>
+            <w:tcBorders>
+              <w:top w:color="000000" w:space="0" w:sz="6" w:val="single"/>
+              <w:left w:color="000000" w:space="0" w:sz="6" w:val="single"/>
+              <w:bottom w:color="000000" w:space="0" w:sz="6" w:val="single"/>
+            </w:tcBorders>
+            <w:shd w:fill="e5e5e5" w:val="clear"/>
+          </w:tcPr>
+          <w:p>
+            <w:pPr>
+              <w:widowControl w:val="0"/>
+              <w:spacing w:after="40" w:before="40" w:line="240" w:lineRule="auto"/>
+              <w:rPr>
+                <w:rFonts w:ascii="Times New Roman" w:cs="Times New Roman" w:eastAsia="Times New Roman" w:hAnsi="Times New Roman"/>
+                <w:sz w:val="20"/>
+                <w:szCs w:val="20"/>
+              </w:rPr>
+            </w:pPr>
+            <w:r>
+              <w:rPr>
+                <w:rFonts w:ascii="Times New Roman" w:cs="Times New Roman" w:eastAsia="Times New Roman" w:hAnsi="Times New Roman"/>
+                <w:sz w:val="20"/>
+                <w:szCs w:val="20"/>
+                <w:rtl w:val="0"/>
+              </w:rPr>
+              <w:t xml:space="preserve">2.0</w:t>
+            </w:r>
             <w:r>
               <w:rPr>
                 <w:rtl w:val="0"/>
@@ -1153,35 +1190,12 @@
             </w:pPr>
             <w:r>
               <w:rPr>
-                <w:rtl w:val="0"/>
-              </w:rPr>
-            </w:r>
-          </w:p>
-        </w:tc>
-        <w:tc>
-          <w:tcPr>
-            <w:tcBorders>
-              <w:top w:color="000000" w:space="0" w:sz="6" w:val="single"/>
-              <w:left w:color="000000" w:space="0" w:sz="6" w:val="single"/>
-              <w:bottom w:color="000000" w:space="0" w:sz="6" w:val="single"/>
-            </w:tcBorders>
-            <w:shd w:fill="e5e5e5" w:val="clear"/>
-          </w:tcPr>
-          <w:p>
-            <w:pPr>
-              <w:widowControl w:val="0"/>
-              <w:spacing w:after="40" w:before="40" w:line="240" w:lineRule="auto"/>
-              <w:ind w:left="0" w:right="0" w:firstLine="0"/>
-              <w:rPr>
                 <w:rFonts w:ascii="Times New Roman" w:cs="Times New Roman" w:eastAsia="Times New Roman" w:hAnsi="Times New Roman"/>
                 <w:sz w:val="20"/>
                 <w:szCs w:val="20"/>
-              </w:rPr>
-            </w:pPr>
-            <w:r>
-              <w:rPr>
                 <w:rtl w:val="0"/>
               </w:rPr>
+              <w:t xml:space="preserve">Added External &amp; Internal Requirements</w:t>
             </w:r>
           </w:p>
         </w:tc>
@@ -1208,8 +1222,12 @@
             </w:pPr>
             <w:r>
               <w:rPr>
+                <w:rFonts w:ascii="Times New Roman" w:cs="Times New Roman" w:eastAsia="Times New Roman" w:hAnsi="Times New Roman"/>
+                <w:sz w:val="20"/>
+                <w:szCs w:val="20"/>
                 <w:rtl w:val="0"/>
               </w:rPr>
+              <w:t xml:space="preserve">Sadhvik Chelmatikary</w:t>
             </w:r>
           </w:p>
         </w:tc>
@@ -3562,7 +3580,7 @@
         <w:tab/>
         <w:t xml:space="preserve">        </w:t>
         <w:tab/>
-        <w:t xml:space="preserve">        9</w:t>
+        <w:t xml:space="preserve">   9-10</w:t>
       </w:r>
     </w:p>
     <w:p>
@@ -3596,7 +3614,7 @@
         <w:tab/>
         <w:t xml:space="preserve">        </w:t>
         <w:tab/>
-        <w:t xml:space="preserve">        9</w:t>
+        <w:t xml:space="preserve">      10</w:t>
         <w:tab/>
       </w:r>
     </w:p>
@@ -3654,8 +3672,7 @@
         <w:t xml:space="preserve">        </w:t>
         <w:tab/>
         <w:tab/>
-        <w:t xml:space="preserve">      10</w:t>
-        <w:tab/>
+        <w:t xml:space="preserve">      11</w:t>
       </w:r>
     </w:p>
     <w:p>
@@ -3687,7 +3704,7 @@
         <w:t xml:space="preserve">        </w:t>
         <w:tab/>
         <w:tab/>
-        <w:t xml:space="preserve">                 10</w:t>
+        <w:t xml:space="preserve">                 11</w:t>
         <w:tab/>
       </w:r>
     </w:p>
@@ -3720,7 +3737,7 @@
         <w:t xml:space="preserve">        </w:t>
         <w:tab/>
         <w:tab/>
-        <w:t xml:space="preserve">                 10</w:t>
+        <w:t xml:space="preserve">                 11</w:t>
         <w:tab/>
       </w:r>
     </w:p>
@@ -7689,7 +7706,7 @@
         <w:ind w:left="0" w:right="0" w:firstLine="0"/>
         <w:rPr>
           <w:rFonts w:ascii="Times New Roman" w:cs="Times New Roman" w:eastAsia="Times New Roman" w:hAnsi="Times New Roman"/>
-          <w:color w:val="5b1a8e"/>
+          <w:color w:val="999999"/>
           <w:sz w:val="27"/>
           <w:szCs w:val="27"/>
         </w:rPr>
@@ -7724,11 +7741,109 @@
     </w:p>
     <w:p>
       <w:pPr>
+        <w:spacing w:after="180" w:lineRule="auto"/>
+        <w:ind w:left="720" w:firstLine="0"/>
+        <w:jc w:val="both"/>
+        <w:rPr>
+          <w:rFonts w:ascii="Times New Roman" w:cs="Times New Roman" w:eastAsia="Times New Roman" w:hAnsi="Times New Roman"/>
+          <w:color w:val="5b1a8e"/>
+          <w:sz w:val="27"/>
+          <w:szCs w:val="27"/>
+        </w:rPr>
+      </w:pPr>
+      <w:r>
+        <w:rPr>
+          <w:rFonts w:ascii="Times New Roman" w:cs="Times New Roman" w:eastAsia="Times New Roman" w:hAnsi="Times New Roman"/>
+          <w:color w:val="5b1a8e"/>
+          <w:sz w:val="27"/>
+          <w:szCs w:val="27"/>
+          <w:rtl w:val="0"/>
+        </w:rPr>
+        <w:t xml:space="preserve">1 The system must provide an interface to the User module so that the users can see their dealt cards and make decisions in the game. The interface should be of a visual format with the following fields: cards, current balance</w:t>
+      </w:r>
+    </w:p>
+    <w:p>
+      <w:pPr>
+        <w:spacing w:after="180" w:lineRule="auto"/>
+        <w:ind w:left="720" w:firstLine="0"/>
+        <w:jc w:val="both"/>
+        <w:rPr>
+          <w:rFonts w:ascii="Times New Roman" w:cs="Times New Roman" w:eastAsia="Times New Roman" w:hAnsi="Times New Roman"/>
+          <w:color w:val="5b1a8e"/>
+          <w:sz w:val="27"/>
+          <w:szCs w:val="27"/>
+        </w:rPr>
+      </w:pPr>
+      <w:r>
+        <w:rPr>
+          <w:rFonts w:ascii="Times New Roman" w:cs="Times New Roman" w:eastAsia="Times New Roman" w:hAnsi="Times New Roman"/>
+          <w:color w:val="5b1a8e"/>
+          <w:sz w:val="27"/>
+          <w:szCs w:val="27"/>
+          <w:rtl w:val="0"/>
+        </w:rPr>
+        <w:t xml:space="preserve">2 The system must provide an interface to the User module so they can login to the system. The interface should consist of 2 text fields: username and password. The user must be able to provide input in the form of text.  The system must also give a visual cue if there was an error in any of the entries. The system should suggest the user to try inputting their information again.</w:t>
+      </w:r>
+    </w:p>
+    <w:p>
+      <w:pPr>
+        <w:spacing w:after="180" w:lineRule="auto"/>
+        <w:ind w:left="720" w:firstLine="0"/>
+        <w:jc w:val="both"/>
+        <w:rPr>
+          <w:rFonts w:ascii="Times New Roman" w:cs="Times New Roman" w:eastAsia="Times New Roman" w:hAnsi="Times New Roman"/>
+          <w:color w:val="5b1a8e"/>
+          <w:sz w:val="27"/>
+          <w:szCs w:val="27"/>
+        </w:rPr>
+      </w:pPr>
+      <w:r>
+        <w:rPr>
+          <w:rFonts w:ascii="Times New Roman" w:cs="Times New Roman" w:eastAsia="Times New Roman" w:hAnsi="Times New Roman"/>
+          <w:color w:val="5b1a8e"/>
+          <w:sz w:val="27"/>
+          <w:szCs w:val="27"/>
+          <w:rtl w:val="0"/>
+        </w:rPr>
+        <w:t xml:space="preserve">3 The system must provide an interface to end their game session through a visual cue.</w:t>
+      </w:r>
+    </w:p>
+    <w:p>
+      <w:pPr>
+        <w:spacing w:after="180" w:lineRule="auto"/>
+        <w:ind w:left="720" w:firstLine="0"/>
+        <w:jc w:val="both"/>
+        <w:rPr>
+          <w:rFonts w:ascii="Times New Roman" w:cs="Times New Roman" w:eastAsia="Times New Roman" w:hAnsi="Times New Roman"/>
+          <w:b w:val="1"/>
+          <w:bCs w:val="1"/>
+          <w:sz w:val="30"/>
+          <w:szCs w:val="30"/>
+        </w:rPr>
+      </w:pPr>
+      <w:r>
+        <w:rPr>
+          <w:rFonts w:ascii="Times New Roman" w:cs="Times New Roman" w:eastAsia="Times New Roman" w:hAnsi="Times New Roman"/>
+          <w:color w:val="5b1a8e"/>
+          <w:sz w:val="27"/>
+          <w:szCs w:val="27"/>
+          <w:rtl w:val="0"/>
+        </w:rPr>
+        <w:t xml:space="preserve">4 The system must provide an interface across different computers to share their game data and progress over TCP protocol.</w:t>
+      </w:r>
+      <w:r>
+        <w:rPr>
+          <w:rtl w:val="0"/>
+        </w:rPr>
+      </w:r>
+    </w:p>
+    <w:p>
+      <w:pPr>
         <w:spacing w:after="300" w:before="240" w:lineRule="auto"/>
         <w:ind w:left="0" w:right="0" w:firstLine="0"/>
         <w:rPr>
           <w:rFonts w:ascii="Times New Roman" w:cs="Times New Roman" w:eastAsia="Times New Roman" w:hAnsi="Times New Roman"/>
-          <w:color w:val="5b1a8e"/>
+          <w:color w:val="999999"/>
           <w:sz w:val="27"/>
           <w:szCs w:val="27"/>
         </w:rPr>
@@ -7757,13 +7872,113 @@
       </w:r>
       <w:r>
         <w:rPr>
-          <w:rFonts w:ascii="Times New Roman" w:cs="Times New Roman" w:eastAsia="Times New Roman" w:hAnsi="Times New Roman"/>
-          <w:color w:val="5b1a8e"/>
-          <w:sz w:val="27"/>
-          <w:szCs w:val="27"/>
-          <w:rtl w:val="0"/>
-        </w:rPr>
+          <w:rtl w:val="0"/>
+        </w:rPr>
+      </w:r>
+    </w:p>
+    <w:p>
+      <w:pPr>
+        <w:ind w:left="720" w:firstLine="0"/>
+        <w:jc w:val="both"/>
+        <w:rPr>
+          <w:rFonts w:ascii="Times New Roman" w:cs="Times New Roman" w:eastAsia="Times New Roman" w:hAnsi="Times New Roman"/>
+          <w:color w:val="5b1a8e"/>
+          <w:sz w:val="27"/>
+          <w:szCs w:val="27"/>
+        </w:rPr>
+      </w:pPr>
+      <w:r>
+        <w:rPr>
+          <w:rFonts w:ascii="Times New Roman" w:cs="Times New Roman" w:eastAsia="Times New Roman" w:hAnsi="Times New Roman"/>
+          <w:color w:val="5b1a8e"/>
+          <w:sz w:val="27"/>
+          <w:szCs w:val="27"/>
+          <w:rtl w:val="0"/>
+        </w:rPr>
+        <w:t xml:space="preserve">1 The system must represent each card with a different number value. The system must use the card’s value to compute score</w:t>
         <w:br w:type="textWrapping"/>
+        <w:t xml:space="preserve">2 The system must randomize the card of decks with built in pseudorandom generator before shuffling each time</w:t>
+        <w:br w:type="textWrapping"/>
+        <w:t xml:space="preserve">3  The system should fill the table with different players based on the queue of waiting clients in a first come first serve fashion.</w:t>
+        <w:br w:type="textWrapping"/>
+        <w:t xml:space="preserve">4 The system must be able to restrict the number of cards to be drawn after the amount 21 has been exceeded by the users</w:t>
+        <w:br w:type="textWrapping"/>
+      </w:r>
+    </w:p>
+    <w:p>
+      <w:pPr>
+        <w:spacing w:after="780" w:before="240" w:lineRule="auto"/>
+        <w:ind w:left="0" w:right="0" w:firstLine="0"/>
+        <w:jc w:val="center"/>
+        <w:rPr>
+          <w:rFonts w:ascii="Times New Roman" w:cs="Times New Roman" w:eastAsia="Times New Roman" w:hAnsi="Times New Roman"/>
+          <w:b w:val="1"/>
+          <w:bCs w:val="1"/>
+          <w:sz w:val="39"/>
+          <w:szCs w:val="39"/>
+        </w:rPr>
+      </w:pPr>
+      <w:r>
+        <w:rPr>
+          <w:rtl w:val="0"/>
+        </w:rPr>
+      </w:r>
+    </w:p>
+    <w:p>
+      <w:pPr>
+        <w:spacing w:after="780" w:before="240" w:lineRule="auto"/>
+        <w:ind w:left="0" w:right="0" w:firstLine="0"/>
+        <w:jc w:val="center"/>
+        <w:rPr>
+          <w:rFonts w:ascii="Times New Roman" w:cs="Times New Roman" w:eastAsia="Times New Roman" w:hAnsi="Times New Roman"/>
+          <w:b w:val="1"/>
+          <w:bCs w:val="1"/>
+          <w:sz w:val="39"/>
+          <w:szCs w:val="39"/>
+        </w:rPr>
+      </w:pPr>
+      <w:r>
+        <w:rPr>
+          <w:rtl w:val="0"/>
+        </w:rPr>
+      </w:r>
+    </w:p>
+    <w:p>
+      <w:pPr>
+        <w:spacing w:after="780" w:before="240" w:lineRule="auto"/>
+        <w:ind w:left="0" w:right="0" w:firstLine="0"/>
+        <w:jc w:val="center"/>
+        <w:rPr>
+          <w:rFonts w:ascii="Times New Roman" w:cs="Times New Roman" w:eastAsia="Times New Roman" w:hAnsi="Times New Roman"/>
+          <w:b w:val="1"/>
+          <w:bCs w:val="1"/>
+          <w:sz w:val="39"/>
+          <w:szCs w:val="39"/>
+        </w:rPr>
+      </w:pPr>
+      <w:r>
+        <w:rPr>
+          <w:rtl w:val="0"/>
+        </w:rPr>
+      </w:r>
+    </w:p>
+    <w:p>
+      <w:pPr>
+        <w:spacing w:after="780" w:before="240" w:lineRule="auto"/>
+        <w:ind w:left="0" w:right="0" w:firstLine="0"/>
+        <w:jc w:val="center"/>
+        <w:rPr>
+          <w:rFonts w:ascii="Times New Roman" w:cs="Times New Roman" w:eastAsia="Times New Roman" w:hAnsi="Times New Roman"/>
+          <w:b w:val="1"/>
+          <w:bCs w:val="1"/>
+          <w:sz w:val="39"/>
+          <w:szCs w:val="39"/>
+        </w:rPr>
+      </w:pPr>
+      <w:r>
+        <w:rPr>
+          <w:rtl w:val="0"/>
+        </w:rPr>
       </w:r>
     </w:p>
     <w:p>

</xml_diff>